<commit_message>
fix: update teacher to Krutskikh E.I. on title page
</commit_message>
<xml_diff>
--- a/Отчет_Практическая_работа_1.docx
+++ b/Отчет_Практическая_работа_1.docx
@@ -433,7 +433,7 @@
           <w:sz w:val="28"/>
           <w:szCs w:val="28"/>
         </w:rPr>
-        <w:t>Руководитель практики</w:t>
+        <w:t>Преподаватель</w:t>
       </w:r>
       <w:r>
         <w:rPr>
@@ -458,7 +458,7 @@
           <w:sz w:val="28"/>
           <w:szCs w:val="28"/>
         </w:rPr>
-        <w:t>Мальков Александр Анатольевич</w:t>
+        <w:t>Крутских Е.И.</w:t>
       </w:r>
     </w:p>
     <w:p>

</xml_diff>